<commit_message>
Transformacion y selección de variables
</commit_message>
<xml_diff>
--- a/Apuntes.docx
+++ b/Apuntes.docx
@@ -167,6 +167,545 @@
           <w:lang w:val="es-ES"/>
         </w:rPr>
         <w:t>No se funcionó la transformación logaritmo en Presupuesto</w:t>
+      </w:r>
+    </w:p>
+    <w:p>
+      <w:pPr>
+        <w:pStyle w:val="Heading2"/>
+        <w:rPr>
+          <w:lang w:val="es-ES"/>
+        </w:rPr>
+      </w:pPr>
+      <w:r>
+        <w:rPr>
+          <w:lang w:val="es-ES"/>
+        </w:rPr>
+        <w:t>Plan</w:t>
+      </w:r>
+    </w:p>
+    <w:p>
+      <w:pPr>
+        <w:rPr>
+          <w:lang w:val="es-ES"/>
+        </w:rPr>
+      </w:pPr>
+      <w:r>
+        <w:rPr>
+          <w:b/>
+          <w:bCs/>
+          <w:lang w:val="es-ES"/>
+        </w:rPr>
+        <w:t>Paso 1 — Carga y preparación de datos</w:t>
+      </w:r>
+      <w:r>
+        <w:rPr>
+          <w:lang w:val="es-ES"/>
+        </w:rPr>
+        <w:t xml:space="preserve"> Leer el archivo, revisar tipos de variables, convertir categóricas a factor, verificar si hay </w:t>
+      </w:r>
+      <w:proofErr w:type="spellStart"/>
+      <w:r>
+        <w:rPr>
+          <w:lang w:val="es-ES"/>
+        </w:rPr>
+        <w:t>NAs</w:t>
+      </w:r>
+      <w:proofErr w:type="spellEnd"/>
+      <w:r>
+        <w:rPr>
+          <w:lang w:val="es-ES"/>
+        </w:rPr>
+        <w:t>.</w:t>
+      </w:r>
+    </w:p>
+    <w:p>
+      <w:pPr>
+        <w:rPr>
+          <w:lang w:val="es-ES"/>
+        </w:rPr>
+      </w:pPr>
+      <w:r>
+        <w:rPr>
+          <w:b/>
+          <w:bCs/>
+          <w:lang w:val="es-ES"/>
+        </w:rPr>
+        <w:t>Paso 2 — Análisis exploratorio (EDA)</w:t>
+      </w:r>
+      <w:r>
+        <w:rPr>
+          <w:lang w:val="es-ES"/>
+        </w:rPr>
+        <w:t xml:space="preserve"> Estadísticas descriptivas, matriz de correlaciones entre las numéricas, </w:t>
+      </w:r>
+      <w:proofErr w:type="spellStart"/>
+      <w:r>
+        <w:rPr>
+          <w:lang w:val="es-ES"/>
+        </w:rPr>
+        <w:t>boxplots</w:t>
+      </w:r>
+      <w:proofErr w:type="spellEnd"/>
+      <w:r>
+        <w:rPr>
+          <w:lang w:val="es-ES"/>
+        </w:rPr>
+        <w:t xml:space="preserve"> de IPI por niveles de las categóricas.</w:t>
+      </w:r>
+    </w:p>
+    <w:p>
+      <w:pPr>
+        <w:rPr>
+          <w:lang w:val="es-ES"/>
+        </w:rPr>
+      </w:pPr>
+      <w:r>
+        <w:rPr>
+          <w:b/>
+          <w:bCs/>
+          <w:lang w:val="es-ES"/>
+        </w:rPr>
+        <w:t>Paso 3 — Modelo completo</w:t>
+      </w:r>
+      <w:r>
+        <w:rPr>
+          <w:lang w:val="es-ES"/>
+        </w:rPr>
+        <w:t xml:space="preserve"> Ajustar </w:t>
+      </w:r>
+      <w:proofErr w:type="gramStart"/>
+      <w:r>
+        <w:rPr>
+          <w:lang w:val="es-ES"/>
+        </w:rPr>
+        <w:t>lm(</w:t>
+      </w:r>
+      <w:proofErr w:type="gramEnd"/>
+      <w:r>
+        <w:rPr>
+          <w:lang w:val="es-ES"/>
+        </w:rPr>
+        <w:t xml:space="preserve">IPI ~ X1+X2+...+X10) con todas las variables. R genera las </w:t>
+      </w:r>
+      <w:proofErr w:type="spellStart"/>
+      <w:r>
+        <w:rPr>
+          <w:lang w:val="es-ES"/>
+        </w:rPr>
+        <w:t>dummies</w:t>
+      </w:r>
+      <w:proofErr w:type="spellEnd"/>
+      <w:r>
+        <w:rPr>
+          <w:lang w:val="es-ES"/>
+        </w:rPr>
+        <w:t xml:space="preserve"> automáticamente si están como factor.</w:t>
+      </w:r>
+    </w:p>
+    <w:p>
+      <w:pPr>
+        <w:rPr>
+          <w:lang w:val="es-ES"/>
+        </w:rPr>
+      </w:pPr>
+      <w:r>
+        <w:rPr>
+          <w:b/>
+          <w:bCs/>
+          <w:lang w:val="es-ES"/>
+        </w:rPr>
+        <w:t>Paso 4 — Selección de variables</w:t>
+      </w:r>
+      <w:r>
+        <w:rPr>
+          <w:lang w:val="es-ES"/>
+        </w:rPr>
+        <w:t xml:space="preserve"> Usar </w:t>
+      </w:r>
+      <w:proofErr w:type="gramStart"/>
+      <w:r>
+        <w:rPr>
+          <w:lang w:val="es-ES"/>
+        </w:rPr>
+        <w:t>step(</w:t>
+      </w:r>
+      <w:proofErr w:type="gramEnd"/>
+      <w:r>
+        <w:rPr>
+          <w:lang w:val="es-ES"/>
+        </w:rPr>
+        <w:t>) con criterio AIC (</w:t>
+      </w:r>
+      <w:proofErr w:type="spellStart"/>
+      <w:r>
+        <w:rPr>
+          <w:lang w:val="es-ES"/>
+        </w:rPr>
+        <w:t>backward</w:t>
+      </w:r>
+      <w:proofErr w:type="spellEnd"/>
+      <w:r>
+        <w:rPr>
+          <w:lang w:val="es-ES"/>
+        </w:rPr>
+        <w:t xml:space="preserve"> o </w:t>
+      </w:r>
+      <w:proofErr w:type="spellStart"/>
+      <w:r>
+        <w:rPr>
+          <w:lang w:val="es-ES"/>
+        </w:rPr>
+        <w:t>stepwise</w:t>
+      </w:r>
+      <w:proofErr w:type="spellEnd"/>
+      <w:r>
+        <w:rPr>
+          <w:lang w:val="es-ES"/>
+        </w:rPr>
+        <w:t>) para quedarse con el subconjunto significativo. Comparar con prueba F parcial.</w:t>
+      </w:r>
+    </w:p>
+    <w:p>
+      <w:r>
+        <w:rPr>
+          <w:b/>
+          <w:bCs/>
+          <w:lang w:val="es-ES"/>
+        </w:rPr>
+        <w:t>Paso 5 — Diagnóstico de multicolinealidad</w:t>
+      </w:r>
+      <w:r>
+        <w:rPr>
+          <w:lang w:val="es-ES"/>
+        </w:rPr>
+        <w:t xml:space="preserve"> </w:t>
+      </w:r>
+      <w:proofErr w:type="spellStart"/>
+      <w:proofErr w:type="gramStart"/>
+      <w:r>
+        <w:rPr>
+          <w:lang w:val="es-ES"/>
+        </w:rPr>
+        <w:t>vif</w:t>
+      </w:r>
+      <w:proofErr w:type="spellEnd"/>
+      <w:r>
+        <w:rPr>
+          <w:lang w:val="es-ES"/>
+        </w:rPr>
+        <w:t>(</w:t>
+      </w:r>
+      <w:proofErr w:type="gramEnd"/>
+      <w:r>
+        <w:rPr>
+          <w:lang w:val="es-ES"/>
+        </w:rPr>
+        <w:t xml:space="preserve">) del paquete car. </w:t>
+      </w:r>
+      <w:proofErr w:type="spellStart"/>
+      <w:r>
+        <w:t>Eliminar</w:t>
+      </w:r>
+      <w:proofErr w:type="spellEnd"/>
+      <w:r>
+        <w:t xml:space="preserve"> o </w:t>
+      </w:r>
+      <w:proofErr w:type="spellStart"/>
+      <w:r>
+        <w:t>combinar</w:t>
+      </w:r>
+      <w:proofErr w:type="spellEnd"/>
+      <w:r>
+        <w:t xml:space="preserve"> </w:t>
+      </w:r>
+      <w:proofErr w:type="spellStart"/>
+      <w:r>
+        <w:t>si</w:t>
+      </w:r>
+      <w:proofErr w:type="spellEnd"/>
+      <w:r>
+        <w:t xml:space="preserve"> VIF &gt; 10.</w:t>
+      </w:r>
+    </w:p>
+    <w:p>
+      <w:r>
+        <w:rPr>
+          <w:b/>
+          <w:bCs/>
+        </w:rPr>
+        <w:t xml:space="preserve">Paso 6 — </w:t>
+      </w:r>
+      <w:proofErr w:type="spellStart"/>
+      <w:r>
+        <w:rPr>
+          <w:b/>
+          <w:bCs/>
+        </w:rPr>
+        <w:t>Verificación</w:t>
+      </w:r>
+      <w:proofErr w:type="spellEnd"/>
+      <w:r>
+        <w:rPr>
+          <w:b/>
+          <w:bCs/>
+        </w:rPr>
+        <w:t xml:space="preserve"> de </w:t>
+      </w:r>
+      <w:proofErr w:type="spellStart"/>
+      <w:r>
+        <w:rPr>
+          <w:b/>
+          <w:bCs/>
+        </w:rPr>
+        <w:t>supuestos</w:t>
+      </w:r>
+      <w:proofErr w:type="spellEnd"/>
+    </w:p>
+    <w:p>
+      <w:pPr>
+        <w:numPr>
+          <w:ilvl w:val="0"/>
+          <w:numId w:val="1"/>
+        </w:numPr>
+        <w:rPr>
+          <w:lang w:val="es-ES"/>
+        </w:rPr>
+      </w:pPr>
+      <w:r>
+        <w:rPr>
+          <w:lang w:val="es-ES"/>
+        </w:rPr>
+        <w:t>Normalidad de residuos: Shapiro-Wilk + QQ-</w:t>
+      </w:r>
+      <w:proofErr w:type="spellStart"/>
+      <w:r>
+        <w:rPr>
+          <w:lang w:val="es-ES"/>
+        </w:rPr>
+        <w:t>plot</w:t>
+      </w:r>
+      <w:proofErr w:type="spellEnd"/>
+    </w:p>
+    <w:p>
+      <w:pPr>
+        <w:numPr>
+          <w:ilvl w:val="0"/>
+          <w:numId w:val="1"/>
+        </w:numPr>
+      </w:pPr>
+      <w:proofErr w:type="spellStart"/>
+      <w:r>
+        <w:t>Homocedasticidad</w:t>
+      </w:r>
+      <w:proofErr w:type="spellEnd"/>
+      <w:r>
+        <w:t>: Breusch-Pagan (</w:t>
+      </w:r>
+      <w:proofErr w:type="spellStart"/>
+      <w:r>
+        <w:t>lmtest</w:t>
+      </w:r>
+      <w:proofErr w:type="spellEnd"/>
+      <w:r>
+        <w:t>)</w:t>
+      </w:r>
+    </w:p>
+    <w:p>
+      <w:pPr>
+        <w:numPr>
+          <w:ilvl w:val="0"/>
+          <w:numId w:val="1"/>
+        </w:numPr>
+      </w:pPr>
+      <w:proofErr w:type="spellStart"/>
+      <w:r>
+        <w:t>Independencia</w:t>
+      </w:r>
+      <w:proofErr w:type="spellEnd"/>
+      <w:r>
+        <w:t>: Durbin-Watson</w:t>
+      </w:r>
+    </w:p>
+    <w:p>
+      <w:pPr>
+        <w:numPr>
+          <w:ilvl w:val="0"/>
+          <w:numId w:val="1"/>
+        </w:numPr>
+      </w:pPr>
+      <w:proofErr w:type="spellStart"/>
+      <w:r>
+        <w:t>Linealidad</w:t>
+      </w:r>
+      <w:proofErr w:type="spellEnd"/>
+      <w:r>
+        <w:t xml:space="preserve">: </w:t>
+      </w:r>
+      <w:proofErr w:type="spellStart"/>
+      <w:r>
+        <w:t>gráfico</w:t>
+      </w:r>
+      <w:proofErr w:type="spellEnd"/>
+      <w:r>
+        <w:t xml:space="preserve"> </w:t>
+      </w:r>
+      <w:proofErr w:type="spellStart"/>
+      <w:r>
+        <w:t>residuos</w:t>
+      </w:r>
+      <w:proofErr w:type="spellEnd"/>
+      <w:r>
+        <w:t xml:space="preserve"> vs Ŷ</w:t>
+      </w:r>
+    </w:p>
+    <w:p>
+      <w:pPr>
+        <w:rPr>
+          <w:lang w:val="es-ES"/>
+        </w:rPr>
+      </w:pPr>
+      <w:r>
+        <w:rPr>
+          <w:b/>
+          <w:bCs/>
+          <w:lang w:val="es-ES"/>
+        </w:rPr>
+        <w:t>Paso 7 — Observaciones influyentes</w:t>
+      </w:r>
+      <w:r>
+        <w:rPr>
+          <w:lang w:val="es-ES"/>
+        </w:rPr>
+        <w:t xml:space="preserve"> Distancia de Cook, </w:t>
+      </w:r>
+      <w:proofErr w:type="spellStart"/>
+      <w:r>
+        <w:rPr>
+          <w:lang w:val="es-ES"/>
+        </w:rPr>
+        <w:t>leverage</w:t>
+      </w:r>
+      <w:proofErr w:type="spellEnd"/>
+      <w:r>
+        <w:rPr>
+          <w:lang w:val="es-ES"/>
+        </w:rPr>
+        <w:t xml:space="preserve">, residuos </w:t>
+      </w:r>
+      <w:proofErr w:type="spellStart"/>
+      <w:r>
+        <w:rPr>
+          <w:lang w:val="es-ES"/>
+        </w:rPr>
+        <w:t>studentizados</w:t>
+      </w:r>
+      <w:proofErr w:type="spellEnd"/>
+      <w:r>
+        <w:rPr>
+          <w:lang w:val="es-ES"/>
+        </w:rPr>
+        <w:t>.</w:t>
+      </w:r>
+    </w:p>
+    <w:p>
+      <w:pPr>
+        <w:rPr>
+          <w:lang w:val="es-ES"/>
+        </w:rPr>
+      </w:pPr>
+      <w:r>
+        <w:rPr>
+          <w:b/>
+          <w:bCs/>
+          <w:lang w:val="es-ES"/>
+        </w:rPr>
+        <w:lastRenderedPageBreak/>
+        <w:t>Paso 8 — Correcciones si aplica</w:t>
+      </w:r>
+      <w:r>
+        <w:rPr>
+          <w:lang w:val="es-ES"/>
+        </w:rPr>
+        <w:t xml:space="preserve"> Transformaciones Box-Cox, WLS, o eliminar </w:t>
+      </w:r>
+      <w:proofErr w:type="spellStart"/>
+      <w:r>
+        <w:rPr>
+          <w:lang w:val="es-ES"/>
+        </w:rPr>
+        <w:t>outliers</w:t>
+      </w:r>
+      <w:proofErr w:type="spellEnd"/>
+      <w:r>
+        <w:rPr>
+          <w:lang w:val="es-ES"/>
+        </w:rPr>
+        <w:t xml:space="preserve"> justificadamente.</w:t>
+      </w:r>
+    </w:p>
+    <w:p>
+      <w:pPr>
+        <w:rPr>
+          <w:lang w:val="es-ES"/>
+        </w:rPr>
+      </w:pPr>
+      <w:r>
+        <w:rPr>
+          <w:b/>
+          <w:bCs/>
+          <w:lang w:val="es-ES"/>
+        </w:rPr>
+        <w:t>Paso 9 — Modelo final</w:t>
+      </w:r>
+      <w:r>
+        <w:rPr>
+          <w:lang w:val="es-ES"/>
+        </w:rPr>
+        <w:t xml:space="preserve"> Reajustar, reportar R², R² ajustado, RMSE, tabla de coeficientes con intervalos de confianza.</w:t>
+      </w:r>
+    </w:p>
+    <w:p>
+      <w:pPr>
+        <w:rPr>
+          <w:lang w:val="es-ES"/>
+        </w:rPr>
+      </w:pPr>
+      <w:r>
+        <w:rPr>
+          <w:b/>
+          <w:bCs/>
+          <w:lang w:val="es-ES"/>
+        </w:rPr>
+        <w:t>Paso 10 — Interpretación</w:t>
+      </w:r>
+      <w:r>
+        <w:rPr>
+          <w:lang w:val="es-ES"/>
+        </w:rPr>
+        <w:t xml:space="preserve"> Explicar cada </w:t>
+      </w:r>
+      <w:r>
+        <w:t>β</w:t>
+      </w:r>
+      <w:r>
+        <w:rPr>
+          <w:lang w:val="es-ES"/>
+        </w:rPr>
+        <w:t xml:space="preserve">̂ significativo en contexto del IPI de </w:t>
+      </w:r>
+      <w:proofErr w:type="spellStart"/>
+      <w:r>
+        <w:rPr>
+          <w:lang w:val="es-ES"/>
+        </w:rPr>
+        <w:t>TechFlow</w:t>
+      </w:r>
+      <w:proofErr w:type="spellEnd"/>
+      <w:r>
+        <w:rPr>
+          <w:lang w:val="es-ES"/>
+        </w:rPr>
+        <w:t>.</w:t>
       </w:r>
     </w:p>
     <w:p>
@@ -184,6 +723,163 @@
     </w:sectPr>
   </w:body>
 </w:document>
+</file>
+
+<file path=word/numbering.xml><?xml version="1.0" encoding="utf-8"?>
+<w:numbering xmlns:wpc="http://schemas.microsoft.com/office/word/2010/wordprocessingCanvas" xmlns:cx="http://schemas.microsoft.com/office/drawing/2014/chartex" xmlns:cx1="http://schemas.microsoft.com/office/drawing/2015/9/8/chartex" xmlns:cx2="http://schemas.microsoft.com/office/drawing/2015/10/21/chartex" xmlns:cx3="http://schemas.microsoft.com/office/drawing/2016/5/9/chartex" xmlns:cx4="http://schemas.microsoft.com/office/drawing/2016/5/10/chartex" xmlns:cx5="http://schemas.microsoft.com/office/drawing/2016/5/11/chartex" xmlns:cx6="http://schemas.microsoft.com/office/drawing/2016/5/12/chartex" xmlns:cx7="http://schemas.microsoft.com/office/drawing/2016/5/13/chartex" xmlns:cx8="http://schemas.microsoft.com/office/drawing/2016/5/14/chartex" xmlns:mc="http://schemas.openxmlformats.org/markup-compatibility/2006" xmlns:aink="http://schemas.microsoft.com/office/drawing/2016/ink" xmlns:am3d="http://schemas.microsoft.com/office/drawing/2017/model3d" xmlns:o="urn:schemas-microsoft-com:office:office" xmlns:oel="http://schemas.microsoft.com/office/2019/extlst" xmlns:r="http://schemas.openxmlformats.org/officeDocument/2006/relationships" xmlns:m="http://schemas.openxmlformats.org/officeDocument/2006/math" xmlns:v="urn:schemas-microsoft-com:vml" xmlns:wp14="http://schemas.microsoft.com/office/word/2010/wordprocessingDrawing" xmlns:wp="http://schemas.openxmlformats.org/drawingml/2006/wordprocessingDrawing" xmlns:w10="urn:schemas-microsoft-com:office:word" xmlns:w="http://schemas.openxmlformats.org/wordprocessingml/2006/main" xmlns:w14="http://schemas.microsoft.com/office/word/2010/wordml" xmlns:w15="http://schemas.microsoft.com/office/word/2012/wordml" xmlns:w16cex="http://schemas.microsoft.com/office/word/2018/wordml/cex" xmlns:w16cid="http://schemas.microsoft.com/office/word/2016/wordml/cid" xmlns:w16="http://schemas.microsoft.com/office/word/2018/wordml" xmlns:w16du="http://schemas.microsoft.com/office/word/2023/wordml/word16du" xmlns:w16sdtdh="http://schemas.microsoft.com/office/word/2020/wordml/sdtdatahash" xmlns:w16sdtfl="http://schemas.microsoft.com/office/word/2024/wordml/sdtformatlock" xmlns:w16se="http://schemas.microsoft.com/office/word/2015/wordml/symex" xmlns:wpg="http://schemas.microsoft.com/office/word/2010/wordprocessingGroup" xmlns:wpi="http://schemas.microsoft.com/office/word/2010/wordprocessingInk" xmlns:wne="http://schemas.microsoft.com/office/word/2006/wordml" xmlns:wps="http://schemas.microsoft.com/office/word/2010/wordprocessingShape" mc:Ignorable="w14 w15 w16se w16cid w16 w16cex w16sdtdh w16sdtfl w16du wp14">
+  <w:abstractNum w:abstractNumId="0" w15:restartNumberingAfterBreak="0">
+    <w:nsid w:val="7101061D"/>
+    <w:multiLevelType w:val="multilevel"/>
+    <w:tmpl w:val="7A14D6D8"/>
+    <w:lvl w:ilvl="0">
+      <w:start w:val="1"/>
+      <w:numFmt w:val="bullet"/>
+      <w:lvlText w:val=""/>
+      <w:lvlJc w:val="left"/>
+      <w:pPr>
+        <w:tabs>
+          <w:tab w:val="num" w:pos="720"/>
+        </w:tabs>
+        <w:ind w:left="720" w:hanging="360"/>
+      </w:pPr>
+      <w:rPr>
+        <w:rFonts w:ascii="Symbol" w:hAnsi="Symbol" w:hint="default"/>
+        <w:sz w:val="20"/>
+      </w:rPr>
+    </w:lvl>
+    <w:lvl w:ilvl="1" w:tentative="1">
+      <w:start w:val="1"/>
+      <w:numFmt w:val="bullet"/>
+      <w:lvlText w:val="o"/>
+      <w:lvlJc w:val="left"/>
+      <w:pPr>
+        <w:tabs>
+          <w:tab w:val="num" w:pos="1440"/>
+        </w:tabs>
+        <w:ind w:left="1440" w:hanging="360"/>
+      </w:pPr>
+      <w:rPr>
+        <w:rFonts w:ascii="Courier New" w:hAnsi="Courier New" w:hint="default"/>
+        <w:sz w:val="20"/>
+      </w:rPr>
+    </w:lvl>
+    <w:lvl w:ilvl="2" w:tentative="1">
+      <w:start w:val="1"/>
+      <w:numFmt w:val="bullet"/>
+      <w:lvlText w:val=""/>
+      <w:lvlJc w:val="left"/>
+      <w:pPr>
+        <w:tabs>
+          <w:tab w:val="num" w:pos="2160"/>
+        </w:tabs>
+        <w:ind w:left="2160" w:hanging="360"/>
+      </w:pPr>
+      <w:rPr>
+        <w:rFonts w:ascii="Wingdings" w:hAnsi="Wingdings" w:hint="default"/>
+        <w:sz w:val="20"/>
+      </w:rPr>
+    </w:lvl>
+    <w:lvl w:ilvl="3" w:tentative="1">
+      <w:start w:val="1"/>
+      <w:numFmt w:val="bullet"/>
+      <w:lvlText w:val=""/>
+      <w:lvlJc w:val="left"/>
+      <w:pPr>
+        <w:tabs>
+          <w:tab w:val="num" w:pos="2880"/>
+        </w:tabs>
+        <w:ind w:left="2880" w:hanging="360"/>
+      </w:pPr>
+      <w:rPr>
+        <w:rFonts w:ascii="Wingdings" w:hAnsi="Wingdings" w:hint="default"/>
+        <w:sz w:val="20"/>
+      </w:rPr>
+    </w:lvl>
+    <w:lvl w:ilvl="4" w:tentative="1">
+      <w:start w:val="1"/>
+      <w:numFmt w:val="bullet"/>
+      <w:lvlText w:val=""/>
+      <w:lvlJc w:val="left"/>
+      <w:pPr>
+        <w:tabs>
+          <w:tab w:val="num" w:pos="3600"/>
+        </w:tabs>
+        <w:ind w:left="3600" w:hanging="360"/>
+      </w:pPr>
+      <w:rPr>
+        <w:rFonts w:ascii="Wingdings" w:hAnsi="Wingdings" w:hint="default"/>
+        <w:sz w:val="20"/>
+      </w:rPr>
+    </w:lvl>
+    <w:lvl w:ilvl="5" w:tentative="1">
+      <w:start w:val="1"/>
+      <w:numFmt w:val="bullet"/>
+      <w:lvlText w:val=""/>
+      <w:lvlJc w:val="left"/>
+      <w:pPr>
+        <w:tabs>
+          <w:tab w:val="num" w:pos="4320"/>
+        </w:tabs>
+        <w:ind w:left="4320" w:hanging="360"/>
+      </w:pPr>
+      <w:rPr>
+        <w:rFonts w:ascii="Wingdings" w:hAnsi="Wingdings" w:hint="default"/>
+        <w:sz w:val="20"/>
+      </w:rPr>
+    </w:lvl>
+    <w:lvl w:ilvl="6" w:tentative="1">
+      <w:start w:val="1"/>
+      <w:numFmt w:val="bullet"/>
+      <w:lvlText w:val=""/>
+      <w:lvlJc w:val="left"/>
+      <w:pPr>
+        <w:tabs>
+          <w:tab w:val="num" w:pos="5040"/>
+        </w:tabs>
+        <w:ind w:left="5040" w:hanging="360"/>
+      </w:pPr>
+      <w:rPr>
+        <w:rFonts w:ascii="Wingdings" w:hAnsi="Wingdings" w:hint="default"/>
+        <w:sz w:val="20"/>
+      </w:rPr>
+    </w:lvl>
+    <w:lvl w:ilvl="7" w:tentative="1">
+      <w:start w:val="1"/>
+      <w:numFmt w:val="bullet"/>
+      <w:lvlText w:val=""/>
+      <w:lvlJc w:val="left"/>
+      <w:pPr>
+        <w:tabs>
+          <w:tab w:val="num" w:pos="5760"/>
+        </w:tabs>
+        <w:ind w:left="5760" w:hanging="360"/>
+      </w:pPr>
+      <w:rPr>
+        <w:rFonts w:ascii="Wingdings" w:hAnsi="Wingdings" w:hint="default"/>
+        <w:sz w:val="20"/>
+      </w:rPr>
+    </w:lvl>
+    <w:lvl w:ilvl="8" w:tentative="1">
+      <w:start w:val="1"/>
+      <w:numFmt w:val="bullet"/>
+      <w:lvlText w:val=""/>
+      <w:lvlJc w:val="left"/>
+      <w:pPr>
+        <w:tabs>
+          <w:tab w:val="num" w:pos="6480"/>
+        </w:tabs>
+        <w:ind w:left="6480" w:hanging="360"/>
+      </w:pPr>
+      <w:rPr>
+        <w:rFonts w:ascii="Wingdings" w:hAnsi="Wingdings" w:hint="default"/>
+        <w:sz w:val="20"/>
+      </w:rPr>
+    </w:lvl>
+  </w:abstractNum>
+  <w:num w:numId="1" w16cid:durableId="1355350059">
+    <w:abstractNumId w:val="0"/>
+  </w:num>
+</w:numbering>
 </file>
 
 <file path=word/styles.xml><?xml version="1.0" encoding="utf-8"?>
@@ -788,7 +1484,6 @@
   <w:style w:type="character" w:default="1" w:styleId="DefaultParagraphFont">
     <w:name w:val="Default Paragraph Font"/>
     <w:uiPriority w:val="1"/>
-    <w:semiHidden/>
     <w:unhideWhenUsed/>
   </w:style>
   <w:style w:type="table" w:default="1" w:styleId="TableNormal">

</xml_diff>